<commit_message>
PDF do druku: lista 12 kroków (bez komentarza o zmianie brzmienia)
- 12-krokow-lista.pdf/docx w do-druku/ — sama lista 12 kroków, bez sekcji
  o wcześniejszym brzmieniu i komentarza do zmiany źródłowej

Co-Authored-By: Claude Sonnet 5 <noreply@anthropic.com>
</commit_message>
<xml_diff>
--- a/12-kroków-konspekty-spotkań/12 Kroków na drodze do wolności.docx
+++ b/12-kroków-konspekty-spotkań/12 Kroków na drodze do wolności.docx
@@ -36,7 +36,7 @@
           <w:sz w:val="28"/>
           <w:szCs w:val="28"/>
         </w:rPr>
-        <w:t>12 Kroków</w:t>
+        <w:t xml:space="preserve">12 Kroków </w:t>
       </w:r>
       <w:r>
         <w:rPr>
@@ -45,15 +45,6 @@
           <w:sz w:val="28"/>
           <w:szCs w:val="28"/>
         </w:rPr>
-        <w:t xml:space="preserve"> </w:t>
-      </w:r>
-      <w:r>
-        <w:rPr>
-          <w:b/>
-          <w:bCs/>
-          <w:sz w:val="28"/>
-          <w:szCs w:val="28"/>
-        </w:rPr>
         <w:t>na drodze do wolności</w:t>
       </w:r>
     </w:p>
@@ -85,7 +76,21 @@
           <w:sz w:val="24"/>
           <w:szCs w:val="24"/>
         </w:rPr>
-        <w:t xml:space="preserve">Przyznaliśmy, że jesteśmy bezsilni wobec uzależnienia – że nasze życie stało się niekierowalne. </w:t>
+        <w:t>Przyznaliśmy, że jesteśmy bezsilni wobec uzależnienia</w:t>
+      </w:r>
+      <w:r>
+        <w:rPr>
+          <w:sz w:val="24"/>
+          <w:szCs w:val="24"/>
+        </w:rPr>
+        <w:t xml:space="preserve"> (grzechu)</w:t>
+      </w:r>
+      <w:r>
+        <w:rPr>
+          <w:sz w:val="24"/>
+          <w:szCs w:val="24"/>
+        </w:rPr>
+        <w:t xml:space="preserve"> – że nasze życie stało się niekierowalne. </w:t>
       </w:r>
     </w:p>
     <w:p>
@@ -1194,6 +1199,7 @@
   <w:style w:type="character" w:default="1" w:styleId="Domylnaczcionkaakapitu">
     <w:name w:val="Default Paragraph Font"/>
     <w:uiPriority w:val="1"/>
+    <w:semiHidden/>
     <w:unhideWhenUsed/>
   </w:style>
   <w:style w:type="table" w:default="1" w:styleId="Standardowy">

</xml_diff>